<commit_message>
LECTURE 07 : QUIZ DATA PARRALELISM
</commit_message>
<xml_diff>
--- a/LECTURE_6_OPENMP_MPI/152024150_LOAD_BALANCING_Farhan_Kamil_Hermansyah.docx
+++ b/LECTURE_6_OPENMP_MPI/152024150_LOAD_BALANCING_Farhan_Kamil_Hermansyah.docx
@@ -211,32 +211,34 @@
               <w:jc w:val="both"/>
               <w:rPr>
                 <w:rFonts w:ascii="Times New Roman" w:hAnsi="Times New Roman" w:cs="Times New Roman"/>
-              </w:rPr>
-            </w:pPr>
-            <w:r>
-              <w:rPr>
-                <w:rFonts w:ascii="Times New Roman" w:hAnsi="Times New Roman" w:cs="Times New Roman"/>
                 <w:b/>
                 <w:bCs/>
               </w:rPr>
-              <w:t xml:space="preserve">Dosen </w:t>
-            </w:r>
-            <w:proofErr w:type="spellStart"/>
+            </w:pPr>
             <w:r>
               <w:rPr>
                 <w:rFonts w:ascii="Times New Roman" w:hAnsi="Times New Roman" w:cs="Times New Roman"/>
                 <w:b/>
                 <w:bCs/>
               </w:rPr>
-              <w:t>Pengampu</w:t>
-            </w:r>
-            <w:proofErr w:type="spellEnd"/>
+              <w:t xml:space="preserve">Dosen </w:t>
+            </w:r>
+            <w:proofErr w:type="spellStart"/>
             <w:r>
               <w:rPr>
                 <w:rFonts w:ascii="Times New Roman" w:hAnsi="Times New Roman" w:cs="Times New Roman"/>
                 <w:b/>
                 <w:bCs/>
               </w:rPr>
+              <w:t>Pengampu</w:t>
+            </w:r>
+            <w:proofErr w:type="spellEnd"/>
+            <w:r>
+              <w:rPr>
+                <w:rFonts w:ascii="Times New Roman" w:hAnsi="Times New Roman" w:cs="Times New Roman"/>
+                <w:b/>
+                <w:bCs/>
+              </w:rPr>
               <w:t>:</w:t>
             </w:r>
             <w:r>
@@ -245,6 +247,15 @@
               </w:rPr>
               <w:t xml:space="preserve"> Lisa Kristiana PhD</w:t>
             </w:r>
+          </w:p>
+          <w:p>
+            <w:pPr>
+              <w:spacing w:line="360" w:lineRule="auto"/>
+              <w:jc w:val="both"/>
+              <w:rPr>
+                <w:rFonts w:ascii="Times New Roman" w:hAnsi="Times New Roman" w:cs="Times New Roman"/>
+              </w:rPr>
+            </w:pPr>
           </w:p>
         </w:tc>
       </w:tr>
@@ -260,6 +271,108 @@
           <w:rFonts w:ascii="Times New Roman" w:hAnsi="Times New Roman" w:cs="Times New Roman"/>
         </w:rPr>
       </w:pPr>
+      <w:proofErr w:type="spellStart"/>
+      <w:proofErr w:type="gramStart"/>
+      <w:r>
+        <w:rPr>
+          <w:rFonts w:ascii="Times New Roman" w:hAnsi="Times New Roman" w:cs="Times New Roman"/>
+        </w:rPr>
+        <w:t>Github</w:t>
+      </w:r>
+      <w:proofErr w:type="spellEnd"/>
+      <w:r>
+        <w:rPr>
+          <w:rFonts w:ascii="Times New Roman" w:hAnsi="Times New Roman" w:cs="Times New Roman"/>
+        </w:rPr>
+        <w:t xml:space="preserve"> </w:t>
+      </w:r>
+      <w:r>
+        <w:rPr>
+          <w:rFonts w:ascii="Times New Roman" w:hAnsi="Times New Roman" w:cs="Times New Roman"/>
+        </w:rPr>
+        <w:t>:</w:t>
+      </w:r>
+      <w:proofErr w:type="gramEnd"/>
+      <w:r>
+        <w:rPr>
+          <w:rFonts w:ascii="Times New Roman" w:hAnsi="Times New Roman" w:cs="Times New Roman"/>
+        </w:rPr>
+        <w:t xml:space="preserve"> </w:t>
+      </w:r>
+    </w:p>
+    <w:p>
+      <w:pPr>
+        <w:pBdr>
+          <w:bottom w:val="single" w:sz="6" w:space="1" w:color="auto"/>
+        </w:pBdr>
+        <w:spacing w:after="0" w:line="360" w:lineRule="auto"/>
+        <w:jc w:val="both"/>
+        <w:rPr>
+          <w:rFonts w:ascii="Times New Roman" w:hAnsi="Times New Roman" w:cs="Times New Roman"/>
+          <w:sz w:val="22"/>
+          <w:szCs w:val="22"/>
+        </w:rPr>
+      </w:pPr>
+      <w:r>
+        <w:rPr>
+          <w:rFonts w:ascii="Times New Roman" w:hAnsi="Times New Roman" w:cs="Times New Roman"/>
+          <w:color w:val="4472C4" w:themeColor="accent1"/>
+          <w:sz w:val="22"/>
+          <w:szCs w:val="22"/>
+          <w:u w:val="single"/>
+          <w14:shadow w14:blurRad="38100" w14:dist="25400" w14:dir="5400000" w14:sx="100000" w14:sy="100000" w14:kx="0" w14:ky="0" w14:algn="ctr">
+            <w14:srgbClr w14:val="6E747A">
+              <w14:alpha w14:val="57000"/>
+            </w14:srgbClr>
+          </w14:shadow>
+          <w14:textOutline w14:w="0" w14:cap="flat" w14:cmpd="sng" w14:algn="ctr">
+            <w14:noFill/>
+            <w14:prstDash w14:val="solid"/>
+            <w14:round/>
+          </w14:textOutline>
+        </w:rPr>
+        <w:t>https://github.com/Farmil23/IFB-206-KOMPUTASI-PARALEL-SISTEM</w:t>
+      </w:r>
+      <w:r>
+        <w:rPr>
+          <w:rFonts w:ascii="Times New Roman" w:hAnsi="Times New Roman" w:cs="Times New Roman"/>
+          <w:color w:val="4472C4" w:themeColor="accent1"/>
+          <w:sz w:val="22"/>
+          <w:szCs w:val="22"/>
+          <w:u w:val="single"/>
+          <w14:shadow w14:blurRad="38100" w14:dist="25400" w14:dir="5400000" w14:sx="100000" w14:sy="100000" w14:kx="0" w14:ky="0" w14:algn="ctr">
+            <w14:srgbClr w14:val="6E747A">
+              <w14:alpha w14:val="57000"/>
+            </w14:srgbClr>
+          </w14:shadow>
+          <w14:textOutline w14:w="0" w14:cap="flat" w14:cmpd="sng" w14:algn="ctr">
+            <w14:noFill/>
+            <w14:prstDash w14:val="solid"/>
+            <w14:round/>
+          </w14:textOutline>
+        </w:rPr>
+        <w:t>-</w:t>
+      </w:r>
+      <w:r>
+        <w:rPr>
+          <w:rFonts w:ascii="Times New Roman" w:hAnsi="Times New Roman" w:cs="Times New Roman"/>
+          <w:color w:val="4472C4" w:themeColor="accent1"/>
+          <w:sz w:val="22"/>
+          <w:szCs w:val="22"/>
+          <w:u w:val="single"/>
+          <w14:shadow w14:blurRad="38100" w14:dist="25400" w14:dir="5400000" w14:sx="100000" w14:sy="100000" w14:kx="0" w14:ky="0" w14:algn="ctr">
+            <w14:srgbClr w14:val="6E747A">
+              <w14:alpha w14:val="57000"/>
+            </w14:srgbClr>
+          </w14:shadow>
+          <w14:textOutline w14:w="0" w14:cap="flat" w14:cmpd="sng" w14:algn="ctr">
+            <w14:noFill/>
+            <w14:prstDash w14:val="solid"/>
+            <w14:round/>
+          </w14:textOutline>
+        </w:rPr>
+        <w:t>TERDISTRIBUSI/</w:t>
+      </w:r>
     </w:p>
     <w:p>
       <w:pPr>
@@ -1575,14 +1688,14 @@
         <w:rPr>
           <w:rFonts w:ascii="Times New Roman" w:hAnsi="Times New Roman" w:cs="Times New Roman"/>
         </w:rPr>
-        <w:t xml:space="preserve"> e</w:t>
-      </w:r>
-      <w:proofErr w:type="spellStart"/>
-      <w:r>
-        <w:rPr>
-          <w:rFonts w:ascii="Times New Roman" w:hAnsi="Times New Roman" w:cs="Times New Roman"/>
-        </w:rPr>
-        <w:t>ksekusi</w:t>
+        <w:t xml:space="preserve"> </w:t>
+      </w:r>
+      <w:proofErr w:type="spellStart"/>
+      <w:r>
+        <w:rPr>
+          <w:rFonts w:ascii="Times New Roman" w:hAnsi="Times New Roman" w:cs="Times New Roman"/>
+        </w:rPr>
+        <w:t>eksekusi</w:t>
       </w:r>
       <w:proofErr w:type="spellEnd"/>
       <w:r>
@@ -2643,7 +2756,6 @@
                 <w:sz w:val="20"/>
                 <w:szCs w:val="20"/>
               </w:rPr>
-              <w:lastRenderedPageBreak/>
               <w:t>from</w:t>
             </w:r>
             <w:r>
@@ -5013,7 +5125,6 @@
           <w:bCs/>
           <w:smallCaps/>
         </w:rPr>
-        <w:lastRenderedPageBreak/>
         <w:t xml:space="preserve">Hasil dan </w:t>
       </w:r>
       <w:proofErr w:type="spellStart"/>
@@ -5042,6 +5153,7 @@
       <w:r>
         <w:rPr>
           <w:rFonts w:ascii="Times New Roman" w:hAnsi="Times New Roman" w:cs="Times New Roman"/>
+          <w:noProof/>
         </w:rPr>
         <w:drawing>
           <wp:inline distT="0" distB="0" distL="0" distR="0" wp14:anchorId="7A3A0DF4" wp14:editId="2C8AED3B">
@@ -5681,7 +5793,7 @@
         <w:rPr>
           <w:rFonts w:ascii="Times New Roman" w:hAnsi="Times New Roman" w:cs="Times New Roman"/>
         </w:rPr>
-        <w:t>pemroresan</w:t>
+        <w:t>pemrosesan</w:t>
       </w:r>
       <w:proofErr w:type="spellEnd"/>
       <w:r>
@@ -6170,14 +6282,28 @@
         <w:rPr>
           <w:rFonts w:ascii="Times New Roman" w:hAnsi="Times New Roman" w:cs="Times New Roman"/>
         </w:rPr>
-        <w:t xml:space="preserve"> akan si</w:t>
-      </w:r>
-      <w:proofErr w:type="spellStart"/>
-      <w:r>
-        <w:rPr>
-          <w:rFonts w:ascii="Times New Roman" w:hAnsi="Times New Roman" w:cs="Times New Roman"/>
-        </w:rPr>
-        <w:t>mulasikan</w:t>
+        <w:t xml:space="preserve"> </w:t>
+      </w:r>
+      <w:proofErr w:type="spellStart"/>
+      <w:r>
+        <w:rPr>
+          <w:rFonts w:ascii="Times New Roman" w:hAnsi="Times New Roman" w:cs="Times New Roman"/>
+        </w:rPr>
+        <w:t>akan</w:t>
+      </w:r>
+      <w:proofErr w:type="spellEnd"/>
+      <w:r>
+        <w:rPr>
+          <w:rFonts w:ascii="Times New Roman" w:hAnsi="Times New Roman" w:cs="Times New Roman"/>
+        </w:rPr>
+        <w:t xml:space="preserve"> </w:t>
+      </w:r>
+      <w:proofErr w:type="spellStart"/>
+      <w:r>
+        <w:rPr>
+          <w:rFonts w:ascii="Times New Roman" w:hAnsi="Times New Roman" w:cs="Times New Roman"/>
+        </w:rPr>
+        <w:t>simulasikan</w:t>
       </w:r>
       <w:proofErr w:type="spellEnd"/>
       <w:r>
@@ -6755,7 +6881,7 @@
         <w:rPr>
           <w:rFonts w:ascii="Times New Roman" w:hAnsi="Times New Roman" w:cs="Times New Roman"/>
         </w:rPr>
-        <w:t>pemroresan</w:t>
+        <w:t>pemrosesan</w:t>
       </w:r>
       <w:proofErr w:type="spellEnd"/>
       <w:r>
@@ -7059,13 +7185,7 @@
         <w:rPr>
           <w:rFonts w:ascii="Times New Roman" w:hAnsi="Times New Roman" w:cs="Times New Roman"/>
         </w:rPr>
-        <w:t xml:space="preserve">total </w:t>
-      </w:r>
-      <w:r>
-        <w:rPr>
-          <w:rFonts w:ascii="Times New Roman" w:hAnsi="Times New Roman" w:cs="Times New Roman"/>
-        </w:rPr>
-        <w:t xml:space="preserve"> 1</w:t>
+        <w:t>total  1</w:t>
       </w:r>
       <w:proofErr w:type="gramEnd"/>
       <w:r>
@@ -7247,6 +7367,7 @@
         <w:rPr>
           <w:rFonts w:ascii="Times New Roman" w:hAnsi="Times New Roman" w:cs="Times New Roman"/>
         </w:rPr>
+        <w:lastRenderedPageBreak/>
         <w:t>sekiranya</w:t>
       </w:r>
       <w:proofErr w:type="spellEnd"/>
@@ -7481,7 +7602,6 @@
         <w:rPr>
           <w:rFonts w:ascii="Times New Roman" w:hAnsi="Times New Roman" w:cs="Times New Roman"/>
         </w:rPr>
-        <w:lastRenderedPageBreak/>
         <w:t>melainkan</w:t>
       </w:r>
       <w:proofErr w:type="spellEnd"/>
@@ -8017,7 +8137,13 @@
         <w:rPr>
           <w:rFonts w:ascii="Times New Roman" w:hAnsi="Times New Roman" w:cs="Times New Roman"/>
         </w:rPr>
-        <w:t xml:space="preserve"> 2, worker 3 </w:t>
+        <w:t xml:space="preserve"> 2, worker </w:t>
+      </w:r>
+      <w:r>
+        <w:rPr>
+          <w:rFonts w:ascii="Times New Roman" w:hAnsi="Times New Roman" w:cs="Times New Roman"/>
+        </w:rPr>
+        <w:t xml:space="preserve">2 </w:t>
       </w:r>
       <w:proofErr w:type="spellStart"/>
       <w:r>
@@ -8486,7 +8612,7 @@
         <w:rPr>
           <w:rFonts w:ascii="Times New Roman" w:hAnsi="Times New Roman" w:cs="Times New Roman"/>
         </w:rPr>
-        <w:t>pemroresan</w:t>
+        <w:t>pemrosesan</w:t>
       </w:r>
       <w:proofErr w:type="spellEnd"/>
       <w:r>
@@ -10255,6 +10381,7 @@
   <w:style w:type="character" w:default="1" w:styleId="FontParagrafDefault">
     <w:name w:val="Default Paragraph Font"/>
     <w:uiPriority w:val="1"/>
+    <w:semiHidden/>
     <w:unhideWhenUsed/>
   </w:style>
   <w:style w:type="table" w:default="1" w:styleId="TabelNormal">
@@ -10587,6 +10714,41 @@
       </w:tblBorders>
     </w:tblPr>
   </w:style>
+  <w:style w:type="character" w:styleId="Hyperlink">
+    <w:name w:val="Hyperlink"/>
+    <w:basedOn w:val="FontParagrafDefault"/>
+    <w:uiPriority w:val="99"/>
+    <w:unhideWhenUsed/>
+    <w:rsid w:val="00982E8E"/>
+    <w:rPr>
+      <w:color w:val="0563C1" w:themeColor="hyperlink"/>
+      <w:u w:val="single"/>
+    </w:rPr>
+  </w:style>
+  <w:style w:type="character" w:styleId="SebutanYangBelumTerselesaikan">
+    <w:name w:val="Unresolved Mention"/>
+    <w:basedOn w:val="FontParagrafDefault"/>
+    <w:uiPriority w:val="99"/>
+    <w:semiHidden/>
+    <w:unhideWhenUsed/>
+    <w:rsid w:val="00982E8E"/>
+    <w:rPr>
+      <w:color w:val="605E5C"/>
+      <w:shd w:val="clear" w:color="auto" w:fill="E1DFDD"/>
+    </w:rPr>
+  </w:style>
+  <w:style w:type="character" w:styleId="HiperlinkyangDiikuti">
+    <w:name w:val="FollowedHyperlink"/>
+    <w:basedOn w:val="FontParagrafDefault"/>
+    <w:uiPriority w:val="99"/>
+    <w:semiHidden/>
+    <w:unhideWhenUsed/>
+    <w:rsid w:val="00F03137"/>
+    <w:rPr>
+      <w:color w:val="954F72" w:themeColor="followedHyperlink"/>
+      <w:u w:val="single"/>
+    </w:rPr>
+  </w:style>
 </w:styles>
 </file>
 

</xml_diff>